<commit_message>
Cambios en la documentacion metodology
</commit_message>
<xml_diff>
--- a/Documentation/Metodology/GuardianWater2.docx
+++ b/Documentation/Metodology/GuardianWater2.docx
@@ -1,6 +1,6 @@
 
 <file path=word/document.xml><?xml version="1.0" encoding="utf-8"?>
-<w:document xmlns:wpc="http://schemas.microsoft.com/office/word/2010/wordprocessingCanvas" xmlns:cx="http://schemas.microsoft.com/office/drawing/2014/chartex" xmlns:cx1="http://schemas.microsoft.com/office/drawing/2015/9/8/chartex" xmlns:cx2="http://schemas.microsoft.com/office/drawing/2015/10/21/chartex" xmlns:cx3="http://schemas.microsoft.com/office/drawing/2016/5/9/chartex" xmlns:cx4="http://schemas.microsoft.com/office/drawing/2016/5/10/chartex" xmlns:cx5="http://schemas.microsoft.com/office/drawing/2016/5/11/chartex" xmlns:cx6="http://schemas.microsoft.com/office/drawing/2016/5/12/chartex" xmlns:cx7="http://schemas.microsoft.com/office/drawing/2016/5/13/chartex" xmlns:cx8="http://schemas.microsoft.com/office/drawing/2016/5/14/chartex" xmlns:mc="http://schemas.openxmlformats.org/markup-compatibility/2006" xmlns:aink="http://schemas.microsoft.com/office/drawing/2016/ink" xmlns:am3d="http://schemas.microsoft.com/office/drawing/2017/model3d" xmlns:o="urn:schemas-microsoft-com:office:office" xmlns:r="http://schemas.openxmlformats.org/officeDocument/2006/relationships" xmlns:m="http://schemas.openxmlformats.org/officeDocument/2006/math" xmlns:v="urn:schemas-microsoft-com:vml" xmlns:wp14="http://schemas.microsoft.com/office/word/2010/wordprocessingDrawing" xmlns:wp="http://schemas.openxmlformats.org/drawingml/2006/wordprocessingDrawing" xmlns:w10="urn:schemas-microsoft-com:office:word" xmlns:w="http://schemas.openxmlformats.org/wordprocessingml/2006/main" xmlns:w14="http://schemas.microsoft.com/office/word/2010/wordml" xmlns:w15="http://schemas.microsoft.com/office/word/2012/wordml" xmlns:w16cex="http://schemas.microsoft.com/office/word/2018/wordml/cex" xmlns:w16cid="http://schemas.microsoft.com/office/word/2016/wordml/cid" xmlns:w16="http://schemas.microsoft.com/office/word/2018/wordml" xmlns:w16se="http://schemas.microsoft.com/office/word/2015/wordml/symex" xmlns:wpg="http://schemas.microsoft.com/office/word/2010/wordprocessingGroup" xmlns:wpi="http://schemas.microsoft.com/office/word/2010/wordprocessingInk" xmlns:wne="http://schemas.microsoft.com/office/word/2006/wordml" xmlns:wps="http://schemas.microsoft.com/office/word/2010/wordprocessingShape" mc:Ignorable="w14 w15 w16se w16cid w16 w16cex wp14">
+<w:document xmlns:wpc="http://schemas.microsoft.com/office/word/2010/wordprocessingCanvas" xmlns:cx="http://schemas.microsoft.com/office/drawing/2014/chartex" xmlns:cx1="http://schemas.microsoft.com/office/drawing/2015/9/8/chartex" xmlns:cx2="http://schemas.microsoft.com/office/drawing/2015/10/21/chartex" xmlns:cx3="http://schemas.microsoft.com/office/drawing/2016/5/9/chartex" xmlns:cx4="http://schemas.microsoft.com/office/drawing/2016/5/10/chartex" xmlns:cx5="http://schemas.microsoft.com/office/drawing/2016/5/11/chartex" xmlns:cx6="http://schemas.microsoft.com/office/drawing/2016/5/12/chartex" xmlns:cx7="http://schemas.microsoft.com/office/drawing/2016/5/13/chartex" xmlns:cx8="http://schemas.microsoft.com/office/drawing/2016/5/14/chartex" xmlns:mc="http://schemas.openxmlformats.org/markup-compatibility/2006" xmlns:aink="http://schemas.microsoft.com/office/drawing/2016/ink" xmlns:am3d="http://schemas.microsoft.com/office/drawing/2017/model3d" xmlns:o="urn:schemas-microsoft-com:office:office" xmlns:r="http://schemas.openxmlformats.org/officeDocument/2006/relationships" xmlns:m="http://schemas.openxmlformats.org/officeDocument/2006/math" xmlns:v="urn:schemas-microsoft-com:vml" xmlns:wp14="http://schemas.microsoft.com/office/word/2010/wordprocessingDrawing" xmlns:wp="http://schemas.openxmlformats.org/drawingml/2006/wordprocessingDrawing" xmlns:w10="urn:schemas-microsoft-com:office:word" xmlns:w="http://schemas.openxmlformats.org/wordprocessingml/2006/main" xmlns:w14="http://schemas.microsoft.com/office/word/2010/wordml" xmlns:w15="http://schemas.microsoft.com/office/word/2012/wordml" xmlns:w16cex="http://schemas.microsoft.com/office/word/2018/wordml/cex" xmlns:w16cid="http://schemas.microsoft.com/office/word/2016/wordml/cid" xmlns:w16="http://schemas.microsoft.com/office/word/2018/wordml" xmlns:w16sdtdh="http://schemas.microsoft.com/office/word/2020/wordml/sdtdatahash" xmlns:w16se="http://schemas.microsoft.com/office/word/2015/wordml/symex" xmlns:wpg="http://schemas.microsoft.com/office/word/2010/wordprocessingGroup" xmlns:wpi="http://schemas.microsoft.com/office/word/2010/wordprocessingInk" xmlns:wne="http://schemas.microsoft.com/office/word/2006/wordml" xmlns:wps="http://schemas.microsoft.com/office/word/2010/wordprocessingShape" mc:Ignorable="w14 w15 w16se w16cid w16 w16cex w16sdtdh wp14">
   <w:body>
     <w:p>
       <w:pPr>
@@ -149,16 +149,16 @@
           <w:noProof/>
         </w:rPr>
         <w:drawing>
-          <wp:anchor distT="114300" distB="114300" distL="114300" distR="114300" simplePos="0" relativeHeight="251658240" behindDoc="1" locked="0" layoutInCell="1" hidden="0" allowOverlap="1" wp14:anchorId="422A7045" wp14:editId="7121DC7B">
+          <wp:anchor distT="114300" distB="114300" distL="114300" distR="114300" simplePos="0" relativeHeight="251658240" behindDoc="1" locked="0" layoutInCell="1" hidden="0" allowOverlap="1" wp14:anchorId="422A7045" wp14:editId="6DB0C5D7">
             <wp:simplePos x="0" y="0"/>
             <wp:positionH relativeFrom="column">
-              <wp:posOffset>1674975</wp:posOffset>
+              <wp:posOffset>1676400</wp:posOffset>
             </wp:positionH>
             <wp:positionV relativeFrom="paragraph">
-              <wp:posOffset>148382</wp:posOffset>
+              <wp:posOffset>144144</wp:posOffset>
             </wp:positionV>
-            <wp:extent cx="2377363" cy="2368962"/>
-            <wp:effectExtent l="0" t="0" r="0" b="0"/>
+            <wp:extent cx="2376805" cy="2371725"/>
+            <wp:effectExtent l="0" t="0" r="4445" b="9525"/>
             <wp:wrapNone/>
             <wp:docPr id="1" name="image2.png"/>
             <wp:cNvGraphicFramePr/>
@@ -169,26 +169,34 @@
                     <pic:cNvPr id="0" name="image2.png"/>
                     <pic:cNvPicPr preferRelativeResize="0"/>
                   </pic:nvPicPr>
-                  <pic:blipFill>
+                  <pic:blipFill rotWithShape="1">
                     <a:blip r:embed="rId8"/>
-                    <a:srcRect/>
-                    <a:stretch>
-                      <a:fillRect/>
-                    </a:stretch>
+                    <a:srcRect b="-140"/>
+                    <a:stretch/>
                   </pic:blipFill>
-                  <pic:spPr>
+                  <pic:spPr bwMode="auto">
                     <a:xfrm>
                       <a:off x="0" y="0"/>
-                      <a:ext cx="2377363" cy="2368962"/>
+                      <a:ext cx="2377363" cy="2372282"/>
                     </a:xfrm>
                     <a:prstGeom prst="rect">
                       <a:avLst/>
                     </a:prstGeom>
-                    <a:ln/>
+                    <a:ln>
+                      <a:noFill/>
+                    </a:ln>
+                    <a:extLst>
+                      <a:ext uri="{53640926-AAD7-44D8-BBD7-CCE9431645EC}">
+                        <a14:shadowObscured xmlns:a14="http://schemas.microsoft.com/office/drawing/2010/main"/>
+                      </a:ext>
+                    </a:extLst>
                   </pic:spPr>
                 </pic:pic>
               </a:graphicData>
             </a:graphic>
+            <wp14:sizeRelV relativeFrom="margin">
+              <wp14:pctHeight>0</wp14:pctHeight>
+            </wp14:sizeRelV>
           </wp:anchor>
         </w:drawing>
       </w:r>
@@ -362,10 +370,12 @@
           <w:sz w:val="36"/>
           <w:szCs w:val="36"/>
         </w:rPr>
-        <w:t xml:space="preserve">Erick </w:t>
-      </w:r>
-      <w:proofErr w:type="spellStart"/>
-      <w:r>
+        <w:t>Erick Matias Granillo Mejia</w:t>
+      </w:r>
+    </w:p>
+    <w:p>
+      <w:pPr>
+        <w:jc w:val="center"/>
         <w:rPr>
           <w:rFonts w:ascii="Aptos" w:eastAsia="Times New Roman" w:hAnsi="Aptos" w:cs="Times New Roman"/>
           <w:b/>
@@ -373,9 +383,7 @@
           <w:sz w:val="36"/>
           <w:szCs w:val="36"/>
         </w:rPr>
-        <w:t>Matias</w:t>
-      </w:r>
-      <w:proofErr w:type="spellEnd"/>
+      </w:pPr>
       <w:r>
         <w:rPr>
           <w:rFonts w:ascii="Aptos" w:eastAsia="Times New Roman" w:hAnsi="Aptos" w:cs="Times New Roman"/>
@@ -384,63 +392,7 @@
           <w:sz w:val="36"/>
           <w:szCs w:val="36"/>
         </w:rPr>
-        <w:t xml:space="preserve"> Granillo </w:t>
-      </w:r>
-      <w:proofErr w:type="spellStart"/>
-      <w:r>
-        <w:rPr>
-          <w:rFonts w:ascii="Aptos" w:eastAsia="Times New Roman" w:hAnsi="Aptos" w:cs="Times New Roman"/>
-          <w:b/>
-          <w:bCs/>
-          <w:sz w:val="36"/>
-          <w:szCs w:val="36"/>
-        </w:rPr>
-        <w:t>Mejia</w:t>
-      </w:r>
-      <w:proofErr w:type="spellEnd"/>
-    </w:p>
-    <w:p>
-      <w:pPr>
-        <w:jc w:val="center"/>
-        <w:rPr>
-          <w:rFonts w:ascii="Aptos" w:eastAsia="Times New Roman" w:hAnsi="Aptos" w:cs="Times New Roman"/>
-          <w:b/>
-          <w:bCs/>
-          <w:sz w:val="36"/>
-          <w:szCs w:val="36"/>
-        </w:rPr>
-      </w:pPr>
-      <w:r>
-        <w:rPr>
-          <w:rFonts w:ascii="Aptos" w:eastAsia="Times New Roman" w:hAnsi="Aptos" w:cs="Times New Roman"/>
-          <w:b/>
-          <w:bCs/>
-          <w:sz w:val="36"/>
-          <w:szCs w:val="36"/>
-        </w:rPr>
-        <w:t xml:space="preserve">Derek </w:t>
-      </w:r>
-      <w:proofErr w:type="spellStart"/>
-      <w:r>
-        <w:rPr>
-          <w:rFonts w:ascii="Aptos" w:eastAsia="Times New Roman" w:hAnsi="Aptos" w:cs="Times New Roman"/>
-          <w:b/>
-          <w:bCs/>
-          <w:sz w:val="36"/>
-          <w:szCs w:val="36"/>
-        </w:rPr>
-        <w:t>Sesni</w:t>
-      </w:r>
-      <w:proofErr w:type="spellEnd"/>
-      <w:r>
-        <w:rPr>
-          <w:rFonts w:ascii="Aptos" w:eastAsia="Times New Roman" w:hAnsi="Aptos" w:cs="Times New Roman"/>
-          <w:b/>
-          <w:bCs/>
-          <w:sz w:val="36"/>
-          <w:szCs w:val="36"/>
-        </w:rPr>
-        <w:t xml:space="preserve"> Carreño</w:t>
+        <w:t>Derek Sesni Carreño</w:t>
       </w:r>
     </w:p>
     <w:p>
@@ -495,7 +447,6 @@
           <w:sz w:val="28"/>
           <w:szCs w:val="28"/>
         </w:rPr>
-        <w:lastRenderedPageBreak/>
         <w:t>1</w:t>
       </w:r>
       <w:commentRangeEnd w:id="0"/>
@@ -1065,20 +1016,27 @@
     <w:p>
       <w:pPr>
         <w:rPr>
-          <w:rFonts w:ascii="Aptos" w:eastAsia="Times New Roman" w:hAnsi="Aptos" w:cs="Times New Roman"/>
-        </w:rPr>
-      </w:pPr>
-      <w:r>
-        <w:rPr>
-          <w:rFonts w:ascii="Aptos" w:eastAsia="Times New Roman" w:hAnsi="Aptos" w:cs="Times New Roman"/>
+          <w:rFonts w:asciiTheme="minorHAnsi" w:eastAsia="Times New Roman" w:hAnsiTheme="minorHAnsi" w:cs="Times New Roman"/>
+        </w:rPr>
+      </w:pPr>
+      <w:r>
+        <w:rPr>
+          <w:rFonts w:asciiTheme="minorHAnsi" w:eastAsia="Times New Roman" w:hAnsiTheme="minorHAnsi" w:cs="Times New Roman"/>
           <w:highlight w:val="yellow"/>
         </w:rPr>
-        <w:t xml:space="preserve">Realizar una </w:t>
+        <w:t>Desarrollo</w:t>
+      </w:r>
+      <w:r>
+        <w:rPr>
+          <w:rFonts w:asciiTheme="minorHAnsi" w:eastAsia="Times New Roman" w:hAnsiTheme="minorHAnsi" w:cs="Times New Roman"/>
+          <w:highlight w:val="yellow"/>
+        </w:rPr>
+        <w:t xml:space="preserve"> una </w:t>
       </w:r>
       <w:commentRangeStart w:id="1"/>
       <w:r>
         <w:rPr>
-          <w:rFonts w:ascii="Aptos" w:eastAsia="Times New Roman" w:hAnsi="Aptos" w:cs="Times New Roman"/>
+          <w:rFonts w:asciiTheme="minorHAnsi" w:eastAsia="Times New Roman" w:hAnsiTheme="minorHAnsi" w:cs="Times New Roman"/>
           <w:highlight w:val="yellow"/>
         </w:rPr>
         <w:t>aplicación</w:t>
@@ -1087,42 +1045,43 @@
       <w:r>
         <w:rPr>
           <w:rStyle w:val="Refdecomentario"/>
+          <w:rFonts w:asciiTheme="minorHAnsi" w:hAnsiTheme="minorHAnsi"/>
         </w:rPr>
         <w:commentReference w:id="1"/>
       </w:r>
       <w:r>
         <w:rPr>
-          <w:rFonts w:ascii="Aptos" w:eastAsia="Times New Roman" w:hAnsi="Aptos" w:cs="Times New Roman"/>
+          <w:rFonts w:asciiTheme="minorHAnsi" w:eastAsia="Times New Roman" w:hAnsiTheme="minorHAnsi" w:cs="Times New Roman"/>
         </w:rPr>
         <w:t xml:space="preserve"> web para realizar reporte de fugas de agua y monitoreo en tiempo real del consumo de agua para llevar un control de </w:t>
       </w:r>
       <w:r>
         <w:rPr>
-          <w:rFonts w:ascii="Aptos" w:eastAsia="Times New Roman" w:hAnsi="Aptos" w:cs="Times New Roman"/>
+          <w:rFonts w:asciiTheme="minorHAnsi" w:eastAsia="Times New Roman" w:hAnsiTheme="minorHAnsi" w:cs="Times New Roman"/>
         </w:rPr>
         <w:t>este,</w:t>
       </w:r>
       <w:r>
         <w:rPr>
-          <w:rFonts w:ascii="Aptos" w:eastAsia="Times New Roman" w:hAnsi="Aptos" w:cs="Times New Roman"/>
+          <w:rFonts w:asciiTheme="minorHAnsi" w:eastAsia="Times New Roman" w:hAnsiTheme="minorHAnsi" w:cs="Times New Roman"/>
         </w:rPr>
         <w:t xml:space="preserve"> </w:t>
       </w:r>
       <w:r>
         <w:rPr>
-          <w:rFonts w:ascii="Aptos" w:eastAsia="Times New Roman" w:hAnsi="Aptos" w:cs="Times New Roman"/>
+          <w:rFonts w:asciiTheme="minorHAnsi" w:eastAsia="Times New Roman" w:hAnsiTheme="minorHAnsi" w:cs="Times New Roman"/>
         </w:rPr>
         <w:t>así</w:t>
       </w:r>
       <w:r>
         <w:rPr>
-          <w:rFonts w:ascii="Aptos" w:eastAsia="Times New Roman" w:hAnsi="Aptos" w:cs="Times New Roman"/>
+          <w:rFonts w:asciiTheme="minorHAnsi" w:eastAsia="Times New Roman" w:hAnsiTheme="minorHAnsi" w:cs="Times New Roman"/>
         </w:rPr>
         <w:t xml:space="preserve"> como el gasto mensual de forma intuitiva</w:t>
       </w:r>
       <w:r>
         <w:rPr>
-          <w:rFonts w:ascii="Aptos" w:eastAsia="Times New Roman" w:hAnsi="Aptos" w:cs="Times New Roman"/>
+          <w:rFonts w:asciiTheme="minorHAnsi" w:eastAsia="Times New Roman" w:hAnsiTheme="minorHAnsi" w:cs="Times New Roman"/>
         </w:rPr>
         <w:t>.</w:t>
       </w:r>
@@ -1269,6 +1228,7 @@
         <w:rPr>
           <w:rFonts w:ascii="Aptos" w:eastAsia="Times New Roman" w:hAnsi="Aptos" w:cs="Times New Roman"/>
         </w:rPr>
+        <w:lastRenderedPageBreak/>
         <w:t>Fomentar la participación ciudadana y la cultura del cuidado del agua mediante el uso de la plataforma.</w:t>
       </w:r>
     </w:p>
@@ -1306,7 +1266,6 @@
           <w:sz w:val="28"/>
           <w:szCs w:val="28"/>
         </w:rPr>
-        <w:lastRenderedPageBreak/>
         <w:t xml:space="preserve">1.3. </w:t>
       </w:r>
       <w:r>
@@ -1656,7 +1615,8 @@
           <w:bCs/>
         </w:rPr>
       </w:pPr>
-      <w:commentRangeStart w:id="3"/>
+      <w:bookmarkStart w:id="3" w:name="_Hlk215705521"/>
+      <w:commentRangeStart w:id="4"/>
       <w:r>
         <w:rPr>
           <w:rFonts w:ascii="Aptos" w:eastAsia="Times New Roman" w:hAnsi="Aptos" w:cs="Times New Roman"/>
@@ -1664,21 +1624,23 @@
         </w:rPr>
         <w:t>A</w:t>
       </w:r>
-      <w:commentRangeEnd w:id="3"/>
+      <w:commentRangeEnd w:id="4"/>
       <w:r>
         <w:rPr>
           <w:rStyle w:val="Refdecomentario"/>
-        </w:rPr>
-        <w:commentReference w:id="3"/>
-      </w:r>
-      <w:r>
-        <w:rPr>
-          <w:rFonts w:ascii="Aptos" w:eastAsia="Times New Roman" w:hAnsi="Aptos" w:cs="Times New Roman"/>
           <w:highlight w:val="yellow"/>
         </w:rPr>
+        <w:commentReference w:id="4"/>
+      </w:r>
+      <w:r>
+        <w:rPr>
+          <w:rFonts w:ascii="Aptos" w:eastAsia="Times New Roman" w:hAnsi="Aptos" w:cs="Times New Roman"/>
+          <w:highlight w:val="yellow"/>
+        </w:rPr>
         <w:t xml:space="preserve"> continuación se presentan los requerimientos funcionales y no funcionales del proyecto, los cuales permiten definir con precisión las características, comportamientos y condiciones de calidad que debe cumplir el sistema para garantizar su correcto funcionamiento y satisfacer las necesidades del usuario.</w:t>
       </w:r>
     </w:p>
+    <w:bookmarkEnd w:id="3"/>
     <w:p>
       <w:pPr>
         <w:pStyle w:val="Sinespaciado"/>
@@ -3533,7 +3495,7 @@
         </w:rPr>
         <w:t xml:space="preserve">Para </w:t>
       </w:r>
-      <w:commentRangeStart w:id="4"/>
+      <w:commentRangeStart w:id="5"/>
       <w:r>
         <w:rPr>
           <w:rFonts w:ascii="Aptos" w:hAnsi="Aptos"/>
@@ -3542,13 +3504,13 @@
         </w:rPr>
         <w:t>el</w:t>
       </w:r>
-      <w:commentRangeEnd w:id="4"/>
+      <w:commentRangeEnd w:id="5"/>
       <w:r>
         <w:rPr>
           <w:rStyle w:val="Refdecomentario"/>
           <w:rFonts w:ascii="Arial" w:eastAsia="Arial" w:hAnsi="Arial" w:cs="Arial"/>
         </w:rPr>
-        <w:commentReference w:id="4"/>
+        <w:commentReference w:id="5"/>
       </w:r>
       <w:r>
         <w:rPr>
@@ -3810,45 +3772,14 @@
           <w:szCs w:val="22"/>
         </w:rPr>
       </w:pPr>
-      <w:proofErr w:type="spellStart"/>
-      <w:r>
-        <w:rPr>
-          <w:rStyle w:val="Textoennegrita"/>
-          <w:rFonts w:ascii="Aptos" w:hAnsi="Aptos"/>
-          <w:sz w:val="22"/>
-          <w:szCs w:val="22"/>
-        </w:rPr>
-        <w:t>Product</w:t>
-      </w:r>
-      <w:proofErr w:type="spellEnd"/>
-      <w:r>
-        <w:rPr>
-          <w:rStyle w:val="Textoennegrita"/>
-          <w:rFonts w:ascii="Aptos" w:hAnsi="Aptos"/>
-          <w:sz w:val="22"/>
-          <w:szCs w:val="22"/>
-        </w:rPr>
-        <w:t xml:space="preserve"> </w:t>
-      </w:r>
-      <w:proofErr w:type="spellStart"/>
-      <w:r>
-        <w:rPr>
-          <w:rStyle w:val="Textoennegrita"/>
-          <w:rFonts w:ascii="Aptos" w:hAnsi="Aptos"/>
-          <w:sz w:val="22"/>
-          <w:szCs w:val="22"/>
-        </w:rPr>
-        <w:t>Owner</w:t>
-      </w:r>
-      <w:proofErr w:type="spellEnd"/>
-      <w:r>
-        <w:rPr>
-          <w:rStyle w:val="Textoennegrita"/>
-          <w:rFonts w:ascii="Aptos" w:hAnsi="Aptos"/>
-          <w:sz w:val="22"/>
-          <w:szCs w:val="22"/>
-        </w:rPr>
-        <w:t xml:space="preserve"> (PO)</w:t>
+      <w:r>
+        <w:rPr>
+          <w:rStyle w:val="Textoennegrita"/>
+          <w:rFonts w:ascii="Aptos" w:hAnsi="Aptos"/>
+          <w:sz w:val="22"/>
+          <w:szCs w:val="22"/>
+        </w:rPr>
+        <w:t>Product Owner (PO)</w:t>
       </w:r>
       <w:r>
         <w:rPr>
@@ -4217,43 +4148,7 @@
           <w:sz w:val="22"/>
           <w:szCs w:val="22"/>
         </w:rPr>
-        <w:t xml:space="preserve"> de la aplicación, listo para ser probado o presentado al </w:t>
-      </w:r>
-      <w:proofErr w:type="spellStart"/>
-      <w:r>
-        <w:rPr>
-          <w:rFonts w:ascii="Aptos" w:hAnsi="Aptos"/>
-          <w:sz w:val="22"/>
-          <w:szCs w:val="22"/>
-        </w:rPr>
-        <w:t>Product</w:t>
-      </w:r>
-      <w:proofErr w:type="spellEnd"/>
-      <w:r>
-        <w:rPr>
-          <w:rFonts w:ascii="Aptos" w:hAnsi="Aptos"/>
-          <w:sz w:val="22"/>
-          <w:szCs w:val="22"/>
-        </w:rPr>
-        <w:t xml:space="preserve"> </w:t>
-      </w:r>
-      <w:proofErr w:type="spellStart"/>
-      <w:r>
-        <w:rPr>
-          <w:rFonts w:ascii="Aptos" w:hAnsi="Aptos"/>
-          <w:sz w:val="22"/>
-          <w:szCs w:val="22"/>
-        </w:rPr>
-        <w:t>Owner</w:t>
-      </w:r>
-      <w:proofErr w:type="spellEnd"/>
-      <w:r>
-        <w:rPr>
-          <w:rFonts w:ascii="Aptos" w:hAnsi="Aptos"/>
-          <w:sz w:val="22"/>
-          <w:szCs w:val="22"/>
-        </w:rPr>
-        <w:t>.</w:t>
+        <w:t xml:space="preserve"> de la aplicación, listo para ser probado o presentado al Product Owner.</w:t>
       </w:r>
     </w:p>
     <w:p>
@@ -4416,43 +4311,7 @@
           <w:sz w:val="22"/>
           <w:szCs w:val="22"/>
         </w:rPr>
-        <w:t xml:space="preserve">: Presentación del trabajo completado al </w:t>
-      </w:r>
-      <w:proofErr w:type="spellStart"/>
-      <w:r>
-        <w:rPr>
-          <w:rFonts w:ascii="Aptos" w:hAnsi="Aptos"/>
-          <w:sz w:val="22"/>
-          <w:szCs w:val="22"/>
-        </w:rPr>
-        <w:t>Product</w:t>
-      </w:r>
-      <w:proofErr w:type="spellEnd"/>
-      <w:r>
-        <w:rPr>
-          <w:rFonts w:ascii="Aptos" w:hAnsi="Aptos"/>
-          <w:sz w:val="22"/>
-          <w:szCs w:val="22"/>
-        </w:rPr>
-        <w:t xml:space="preserve"> </w:t>
-      </w:r>
-      <w:proofErr w:type="spellStart"/>
-      <w:r>
-        <w:rPr>
-          <w:rFonts w:ascii="Aptos" w:hAnsi="Aptos"/>
-          <w:sz w:val="22"/>
-          <w:szCs w:val="22"/>
-        </w:rPr>
-        <w:t>Owner</w:t>
-      </w:r>
-      <w:proofErr w:type="spellEnd"/>
-      <w:r>
-        <w:rPr>
-          <w:rFonts w:ascii="Aptos" w:hAnsi="Aptos"/>
-          <w:sz w:val="22"/>
-          <w:szCs w:val="22"/>
-        </w:rPr>
-        <w:t xml:space="preserve"> y posibles usuarios.</w:t>
+        <w:t>: Presentación del trabajo completado al Product Owner y posibles usuarios.</w:t>
       </w:r>
     </w:p>
     <w:p>
@@ -4475,19 +4334,8 @@
           <w:sz w:val="22"/>
           <w:szCs w:val="22"/>
         </w:rPr>
-        <w:t xml:space="preserve">Sprint </w:t>
-      </w:r>
-      <w:proofErr w:type="spellStart"/>
-      <w:r>
-        <w:rPr>
-          <w:rStyle w:val="Textoennegrita"/>
-          <w:rFonts w:ascii="Aptos" w:hAnsi="Aptos"/>
-          <w:sz w:val="22"/>
-          <w:szCs w:val="22"/>
-        </w:rPr>
-        <w:t>Retrospective</w:t>
-      </w:r>
-      <w:proofErr w:type="spellEnd"/>
+        <w:t>Sprint Retrospective</w:t>
+      </w:r>
       <w:r>
         <w:rPr>
           <w:rFonts w:ascii="Aptos" w:hAnsi="Aptos"/>
@@ -4866,7 +4714,6 @@
       <w:pPr>
         <w:pStyle w:val="NormalWeb"/>
         <w:rPr>
-          <w:rFonts w:ascii="Aptos" w:hAnsi="Aptos"/>
           <w:sz w:val="22"/>
           <w:szCs w:val="22"/>
         </w:rPr>
@@ -4874,7 +4721,6 @@
       <w:proofErr w:type="spellStart"/>
       <w:r>
         <w:rPr>
-          <w:rFonts w:ascii="Aptos" w:hAnsi="Aptos"/>
           <w:sz w:val="22"/>
           <w:szCs w:val="22"/>
         </w:rPr>
@@ -4883,11 +4729,10 @@
       <w:proofErr w:type="spellEnd"/>
       <w:r>
         <w:rPr>
-          <w:rFonts w:ascii="Aptos" w:hAnsi="Aptos"/>
-          <w:sz w:val="22"/>
-          <w:szCs w:val="22"/>
-        </w:rPr>
-        <w:t xml:space="preserve"> es un sistema tecnológico orientado a ciudadanos, por lo que debe cumplir con buenas prácticas de diseño, accesibilidad y protección de datos. Las normas aplicadas son:</w:t>
+          <w:sz w:val="22"/>
+          <w:szCs w:val="22"/>
+        </w:rPr>
+        <w:t xml:space="preserve"> es un sistema tecnológico orientado a la ciudadanía, por lo que debe alinearse con lineamientos de diseño, accesibilidad y protección de información que garanticen un uso seguro, inclusivo y confiable. Las normas aplicadas aseguran que la plataforma cumpla con criterios técnicos y legales que respalden su funcionamiento correcto dentro del contexto nacional y bajo estándares internacionales.</w:t>
       </w:r>
     </w:p>
     <w:p>
@@ -4910,7 +4755,7 @@
         </w:rPr>
         <w:t xml:space="preserve">2.3.1 </w:t>
       </w:r>
-      <w:commentRangeStart w:id="5"/>
+      <w:commentRangeStart w:id="6"/>
       <w:r>
         <w:rPr>
           <w:rStyle w:val="Textoennegrita"/>
@@ -5049,13 +4894,13 @@
         </w:rPr>
         <w:t>Se asegura que las necesidades reales de los ciudadanos sean el foco del diseño, priorizando simplicidad, comprensión y relevancia</w:t>
       </w:r>
-      <w:commentRangeEnd w:id="5"/>
+      <w:commentRangeEnd w:id="6"/>
       <w:r>
         <w:rPr>
           <w:rStyle w:val="Refdecomentario"/>
           <w:rFonts w:ascii="Arial" w:eastAsia="Arial" w:hAnsi="Arial" w:cs="Arial"/>
         </w:rPr>
-        <w:commentReference w:id="5"/>
+        <w:commentReference w:id="6"/>
       </w:r>
       <w:r>
         <w:rPr>
@@ -5093,6 +4938,7 @@
           <w:sz w:val="28"/>
           <w:szCs w:val="28"/>
         </w:rPr>
+        <w:lastRenderedPageBreak/>
         <w:t>2.3.4</w:t>
       </w:r>
       <w:r>
@@ -5126,7 +4972,6 @@
         <w:rPr>
           <w:rFonts w:ascii="Aptos" w:hAnsi="Aptos"/>
         </w:rPr>
-        <w:lastRenderedPageBreak/>
         <w:t>Aplica para proteger datos como nombre, correo e información de los usuarios registrados. Se deben emplear medidas de seguridad, cifrado y avisos de privacidad claros.</w:t>
       </w:r>
     </w:p>
@@ -5220,7 +5065,6 @@
         </w:rPr>
         <w:t xml:space="preserve"> </w:t>
       </w:r>
-      <w:proofErr w:type="spellStart"/>
       <w:r>
         <w:rPr>
           <w:rStyle w:val="Textoennegrita"/>
@@ -5228,37 +5072,7 @@
           <w:sz w:val="28"/>
           <w:szCs w:val="28"/>
         </w:rPr>
-        <w:t>Product</w:t>
-      </w:r>
-      <w:proofErr w:type="spellEnd"/>
-      <w:r>
-        <w:rPr>
-          <w:rStyle w:val="Textoennegrita"/>
-          <w:rFonts w:ascii="Aptos" w:hAnsi="Aptos"/>
-          <w:sz w:val="28"/>
-          <w:szCs w:val="28"/>
-        </w:rPr>
-        <w:t xml:space="preserve"> </w:t>
-      </w:r>
-      <w:proofErr w:type="spellStart"/>
-      <w:r>
-        <w:rPr>
-          <w:rStyle w:val="Textoennegrita"/>
-          <w:rFonts w:ascii="Aptos" w:hAnsi="Aptos"/>
-          <w:sz w:val="28"/>
-          <w:szCs w:val="28"/>
-        </w:rPr>
-        <w:t>Owner</w:t>
-      </w:r>
-      <w:proofErr w:type="spellEnd"/>
-      <w:r>
-        <w:rPr>
-          <w:rStyle w:val="Textoennegrita"/>
-          <w:rFonts w:ascii="Aptos" w:hAnsi="Aptos"/>
-          <w:sz w:val="28"/>
-          <w:szCs w:val="28"/>
-        </w:rPr>
-        <w:t xml:space="preserve"> (PO)</w:t>
+        <w:t>Product Owner (PO)</w:t>
       </w:r>
     </w:p>
     <w:p>
@@ -5361,20 +5175,20 @@
         </w:rPr>
         <w:t xml:space="preserve">Facilita las ceremonias </w:t>
       </w:r>
-      <w:commentRangeStart w:id="6"/>
+      <w:commentRangeStart w:id="7"/>
       <w:r>
         <w:rPr>
           <w:rFonts w:ascii="Aptos" w:hAnsi="Aptos"/>
         </w:rPr>
         <w:t>Scrum</w:t>
       </w:r>
-      <w:commentRangeEnd w:id="6"/>
+      <w:commentRangeEnd w:id="7"/>
       <w:r>
         <w:rPr>
           <w:rStyle w:val="Refdecomentario"/>
           <w:rFonts w:ascii="Arial" w:eastAsia="Arial" w:hAnsi="Arial" w:cs="Arial"/>
         </w:rPr>
-        <w:commentReference w:id="6"/>
+        <w:commentReference w:id="7"/>
       </w:r>
       <w:r>
         <w:rPr>
@@ -6870,14 +6684,7 @@
               <w:rPr>
                 <w:rFonts w:ascii="Aptos" w:hAnsi="Aptos"/>
               </w:rPr>
-              <w:t xml:space="preserve">Analizar la cantidad de fugas </w:t>
-            </w:r>
-            <w:r>
-              <w:rPr>
-                <w:rFonts w:ascii="Aptos" w:hAnsi="Aptos"/>
-              </w:rPr>
-              <w:lastRenderedPageBreak/>
-              <w:t>reportadas y atendidas</w:t>
+              <w:t>Analizar la cantidad de fugas reportadas y atendidas</w:t>
             </w:r>
           </w:p>
         </w:tc>
@@ -6896,7 +6703,6 @@
               <w:rPr>
                 <w:rFonts w:ascii="Aptos" w:hAnsi="Aptos"/>
               </w:rPr>
-              <w:lastRenderedPageBreak/>
               <w:t>3</w:t>
             </w:r>
           </w:p>
@@ -6954,14 +6760,7 @@
               <w:rPr>
                 <w:rFonts w:ascii="Aptos" w:hAnsi="Aptos"/>
               </w:rPr>
-              <w:t xml:space="preserve">Al seleccionar el mes, el sistema mostrará un resumen de fugas </w:t>
-            </w:r>
-            <w:r>
-              <w:rPr>
-                <w:rFonts w:ascii="Aptos" w:hAnsi="Aptos"/>
-              </w:rPr>
-              <w:lastRenderedPageBreak/>
-              <w:t>reportadas y solucionadas</w:t>
+              <w:t>Al seleccionar el mes, el sistema mostrará un resumen de fugas reportadas y solucionadas</w:t>
             </w:r>
           </w:p>
         </w:tc>
@@ -6980,7 +6779,6 @@
               <w:rPr>
                 <w:rFonts w:ascii="Aptos" w:hAnsi="Aptos"/>
               </w:rPr>
-              <w:lastRenderedPageBreak/>
               <w:t>El administrador podrá obtener reportes estadísticos del sistema</w:t>
             </w:r>
           </w:p>
@@ -7005,6 +6803,7 @@
               <w:rPr>
                 <w:rFonts w:ascii="Aptos" w:hAnsi="Aptos"/>
               </w:rPr>
+              <w:lastRenderedPageBreak/>
               <w:t>Guardian007</w:t>
             </w:r>
           </w:p>
@@ -7771,19 +7570,19 @@
               </w:rPr>
               <w:t xml:space="preserve">Cuando el cliente acceda al panel y su consumo esté </w:t>
             </w:r>
-            <w:commentRangeStart w:id="7"/>
+            <w:commentRangeStart w:id="8"/>
             <w:r>
               <w:rPr>
                 <w:rFonts w:ascii="Aptos" w:hAnsi="Aptos"/>
               </w:rPr>
               <w:t>por</w:t>
             </w:r>
-            <w:commentRangeEnd w:id="7"/>
+            <w:commentRangeEnd w:id="8"/>
             <w:r>
               <w:rPr>
                 <w:rStyle w:val="Refdecomentario"/>
               </w:rPr>
-              <w:commentReference w:id="7"/>
+              <w:commentReference w:id="8"/>
             </w:r>
             <w:r>
               <w:rPr>
@@ -7866,11 +7665,11 @@
         <w:tblLook w:val="04A0" w:firstRow="1" w:lastRow="0" w:firstColumn="1" w:lastColumn="0" w:noHBand="0" w:noVBand="1"/>
       </w:tblPr>
       <w:tblGrid>
-        <w:gridCol w:w="2427"/>
-        <w:gridCol w:w="2014"/>
-        <w:gridCol w:w="1440"/>
-        <w:gridCol w:w="999"/>
-        <w:gridCol w:w="2139"/>
+        <w:gridCol w:w="2352"/>
+        <w:gridCol w:w="2052"/>
+        <w:gridCol w:w="1347"/>
+        <w:gridCol w:w="951"/>
+        <w:gridCol w:w="2317"/>
       </w:tblGrid>
       <w:tr>
         <w:trPr>
@@ -8768,55 +8567,7 @@
           <w:rStyle w:val="Textoennegrita"/>
           <w:rFonts w:ascii="Aptos" w:hAnsi="Aptos"/>
         </w:rPr>
-        <w:t xml:space="preserve">José Arturo García González, Diego Miguel Rivera Chávez, Erick </w:t>
-      </w:r>
-      <w:proofErr w:type="spellStart"/>
-      <w:r>
-        <w:rPr>
-          <w:rStyle w:val="Textoennegrita"/>
-          <w:rFonts w:ascii="Aptos" w:hAnsi="Aptos"/>
-        </w:rPr>
-        <w:t>Matias</w:t>
-      </w:r>
-      <w:proofErr w:type="spellEnd"/>
-      <w:r>
-        <w:rPr>
-          <w:rStyle w:val="Textoennegrita"/>
-          <w:rFonts w:ascii="Aptos" w:hAnsi="Aptos"/>
-        </w:rPr>
-        <w:t xml:space="preserve"> Granillo </w:t>
-      </w:r>
-      <w:proofErr w:type="spellStart"/>
-      <w:r>
-        <w:rPr>
-          <w:rStyle w:val="Textoennegrita"/>
-          <w:rFonts w:ascii="Aptos" w:hAnsi="Aptos"/>
-        </w:rPr>
-        <w:t>Mejia</w:t>
-      </w:r>
-      <w:proofErr w:type="spellEnd"/>
-      <w:r>
-        <w:rPr>
-          <w:rStyle w:val="Textoennegrita"/>
-          <w:rFonts w:ascii="Aptos" w:hAnsi="Aptos"/>
-        </w:rPr>
-        <w:t xml:space="preserve"> y Derek </w:t>
-      </w:r>
-      <w:proofErr w:type="spellStart"/>
-      <w:r>
-        <w:rPr>
-          <w:rStyle w:val="Textoennegrita"/>
-          <w:rFonts w:ascii="Aptos" w:hAnsi="Aptos"/>
-        </w:rPr>
-        <w:t>Sesni</w:t>
-      </w:r>
-      <w:proofErr w:type="spellEnd"/>
-      <w:r>
-        <w:rPr>
-          <w:rStyle w:val="Textoennegrita"/>
-          <w:rFonts w:ascii="Aptos" w:hAnsi="Aptos"/>
-        </w:rPr>
-        <w:t xml:space="preserve"> Carreño</w:t>
+        <w:t>José Arturo García González, Diego Miguel Rivera Chávez, Erick Matias Granillo Mejia y Derek Sesni Carreño</w:t>
       </w:r>
     </w:p>
     <w:p>
@@ -8895,7 +8646,7 @@
 </file>
 
 <file path=word/comments.xml><?xml version="1.0" encoding="utf-8"?>
-<w:comments xmlns:wpc="http://schemas.microsoft.com/office/word/2010/wordprocessingCanvas" xmlns:cx="http://schemas.microsoft.com/office/drawing/2014/chartex" xmlns:cx1="http://schemas.microsoft.com/office/drawing/2015/9/8/chartex" xmlns:cx2="http://schemas.microsoft.com/office/drawing/2015/10/21/chartex" xmlns:cx3="http://schemas.microsoft.com/office/drawing/2016/5/9/chartex" xmlns:cx4="http://schemas.microsoft.com/office/drawing/2016/5/10/chartex" xmlns:cx5="http://schemas.microsoft.com/office/drawing/2016/5/11/chartex" xmlns:cx6="http://schemas.microsoft.com/office/drawing/2016/5/12/chartex" xmlns:cx7="http://schemas.microsoft.com/office/drawing/2016/5/13/chartex" xmlns:cx8="http://schemas.microsoft.com/office/drawing/2016/5/14/chartex" xmlns:mc="http://schemas.openxmlformats.org/markup-compatibility/2006" xmlns:aink="http://schemas.microsoft.com/office/drawing/2016/ink" xmlns:am3d="http://schemas.microsoft.com/office/drawing/2017/model3d" xmlns:o="urn:schemas-microsoft-com:office:office" xmlns:r="http://schemas.openxmlformats.org/officeDocument/2006/relationships" xmlns:m="http://schemas.openxmlformats.org/officeDocument/2006/math" xmlns:v="urn:schemas-microsoft-com:vml" xmlns:wp14="http://schemas.microsoft.com/office/word/2010/wordprocessingDrawing" xmlns:wp="http://schemas.openxmlformats.org/drawingml/2006/wordprocessingDrawing" xmlns:w10="urn:schemas-microsoft-com:office:word" xmlns:w="http://schemas.openxmlformats.org/wordprocessingml/2006/main" xmlns:w14="http://schemas.microsoft.com/office/word/2010/wordml" xmlns:w15="http://schemas.microsoft.com/office/word/2012/wordml" xmlns:w16cex="http://schemas.microsoft.com/office/word/2018/wordml/cex" xmlns:w16cid="http://schemas.microsoft.com/office/word/2016/wordml/cid" xmlns:w16="http://schemas.microsoft.com/office/word/2018/wordml" xmlns:w16se="http://schemas.microsoft.com/office/word/2015/wordml/symex" xmlns:wpg="http://schemas.microsoft.com/office/word/2010/wordprocessingGroup" xmlns:wpi="http://schemas.microsoft.com/office/word/2010/wordprocessingInk" xmlns:wne="http://schemas.microsoft.com/office/word/2006/wordml" xmlns:wps="http://schemas.microsoft.com/office/word/2010/wordprocessingShape" mc:Ignorable="w14 w15 w16se w16cid w16 w16cex wp14">
+<w:comments xmlns:wpc="http://schemas.microsoft.com/office/word/2010/wordprocessingCanvas" xmlns:cx="http://schemas.microsoft.com/office/drawing/2014/chartex" xmlns:cx1="http://schemas.microsoft.com/office/drawing/2015/9/8/chartex" xmlns:cx2="http://schemas.microsoft.com/office/drawing/2015/10/21/chartex" xmlns:cx3="http://schemas.microsoft.com/office/drawing/2016/5/9/chartex" xmlns:cx4="http://schemas.microsoft.com/office/drawing/2016/5/10/chartex" xmlns:cx5="http://schemas.microsoft.com/office/drawing/2016/5/11/chartex" xmlns:cx6="http://schemas.microsoft.com/office/drawing/2016/5/12/chartex" xmlns:cx7="http://schemas.microsoft.com/office/drawing/2016/5/13/chartex" xmlns:cx8="http://schemas.microsoft.com/office/drawing/2016/5/14/chartex" xmlns:mc="http://schemas.openxmlformats.org/markup-compatibility/2006" xmlns:aink="http://schemas.microsoft.com/office/drawing/2016/ink" xmlns:am3d="http://schemas.microsoft.com/office/drawing/2017/model3d" xmlns:o="urn:schemas-microsoft-com:office:office" xmlns:r="http://schemas.openxmlformats.org/officeDocument/2006/relationships" xmlns:m="http://schemas.openxmlformats.org/officeDocument/2006/math" xmlns:v="urn:schemas-microsoft-com:vml" xmlns:wp14="http://schemas.microsoft.com/office/word/2010/wordprocessingDrawing" xmlns:wp="http://schemas.openxmlformats.org/drawingml/2006/wordprocessingDrawing" xmlns:w10="urn:schemas-microsoft-com:office:word" xmlns:w="http://schemas.openxmlformats.org/wordprocessingml/2006/main" xmlns:w14="http://schemas.microsoft.com/office/word/2010/wordml" xmlns:w15="http://schemas.microsoft.com/office/word/2012/wordml" xmlns:w16cex="http://schemas.microsoft.com/office/word/2018/wordml/cex" xmlns:w16cid="http://schemas.microsoft.com/office/word/2016/wordml/cid" xmlns:w16="http://schemas.microsoft.com/office/word/2018/wordml" xmlns:w16sdtdh="http://schemas.microsoft.com/office/word/2020/wordml/sdtdatahash" xmlns:w16se="http://schemas.microsoft.com/office/word/2015/wordml/symex" xmlns:wpg="http://schemas.microsoft.com/office/word/2010/wordprocessingGroup" xmlns:wpi="http://schemas.microsoft.com/office/word/2010/wordprocessingInk" xmlns:wne="http://schemas.microsoft.com/office/word/2006/wordml" xmlns:wps="http://schemas.microsoft.com/office/word/2010/wordprocessingShape" mc:Ignorable="w14 w15 w16se w16cid w16 w16cex w16sdtdh wp14">
   <w:comment w:id="0" w:author="Usuario" w:date="2025-11-17T12:03:00Z" w:initials="U">
     <w:p>
       <w:pPr>
@@ -8957,7 +8708,7 @@
       </w:r>
     </w:p>
   </w:comment>
-  <w:comment w:id="3" w:author="Usuario" w:date="2025-11-17T12:20:00Z" w:initials="U">
+  <w:comment w:id="4" w:author="Usuario" w:date="2025-11-17T12:20:00Z" w:initials="U">
     <w:p>
       <w:pPr>
         <w:pStyle w:val="Textocomentario"/>
@@ -8973,7 +8724,7 @@
       </w:r>
     </w:p>
   </w:comment>
-  <w:comment w:id="4" w:author="Usuario" w:date="2025-11-17T12:22:00Z" w:initials="U">
+  <w:comment w:id="5" w:author="Usuario" w:date="2025-11-17T12:22:00Z" w:initials="U">
     <w:p>
       <w:pPr>
         <w:pStyle w:val="Textocomentario"/>
@@ -8989,7 +8740,7 @@
       </w:r>
     </w:p>
   </w:comment>
-  <w:comment w:id="5" w:author="Usuario" w:date="2025-11-17T12:23:00Z" w:initials="U">
+  <w:comment w:id="6" w:author="Usuario" w:date="2025-11-17T12:23:00Z" w:initials="U">
     <w:p>
       <w:pPr>
         <w:pStyle w:val="Textocomentario"/>
@@ -9002,23 +8753,26 @@
       </w:r>
       <w:r>
         <w:t>Complementar información</w:t>
-      </w:r>
-    </w:p>
-  </w:comment>
-  <w:comment w:id="6" w:author="Usuario" w:date="2025-11-17T12:25:00Z" w:initials="U">
-    <w:p>
-      <w:pPr>
-        <w:pStyle w:val="Textocomentario"/>
-      </w:pPr>
-      <w:r>
-        <w:rPr>
-          <w:rStyle w:val="Refdecomentario"/>
-        </w:rPr>
-        <w:annotationRef/>
       </w:r>
     </w:p>
   </w:comment>
   <w:comment w:id="7" w:author="Usuario" w:date="2025-11-17T12:25:00Z" w:initials="U">
+    <w:p>
+      <w:pPr>
+        <w:pStyle w:val="Textocomentario"/>
+      </w:pPr>
+      <w:r>
+        <w:rPr>
+          <w:rStyle w:val="Refdecomentario"/>
+        </w:rPr>
+        <w:annotationRef/>
+      </w:r>
+      <w:r>
+        <w:t>Poner quienes son</w:t>
+      </w:r>
+    </w:p>
+  </w:comment>
+  <w:comment w:id="8" w:author="Usuario" w:date="2025-11-17T12:25:00Z" w:initials="U">
     <w:p>
       <w:pPr>
         <w:pStyle w:val="Textocomentario"/>
@@ -9043,7 +8797,7 @@
 </file>
 
 <file path=word/commentsExtended.xml><?xml version="1.0" encoding="utf-8"?>
-<w15:commentsEx xmlns:wpc="http://schemas.microsoft.com/office/word/2010/wordprocessingCanvas" xmlns:cx="http://schemas.microsoft.com/office/drawing/2014/chartex" xmlns:cx1="http://schemas.microsoft.com/office/drawing/2015/9/8/chartex" xmlns:cx2="http://schemas.microsoft.com/office/drawing/2015/10/21/chartex" xmlns:cx3="http://schemas.microsoft.com/office/drawing/2016/5/9/chartex" xmlns:cx4="http://schemas.microsoft.com/office/drawing/2016/5/10/chartex" xmlns:cx5="http://schemas.microsoft.com/office/drawing/2016/5/11/chartex" xmlns:cx6="http://schemas.microsoft.com/office/drawing/2016/5/12/chartex" xmlns:cx7="http://schemas.microsoft.com/office/drawing/2016/5/13/chartex" xmlns:cx8="http://schemas.microsoft.com/office/drawing/2016/5/14/chartex" xmlns:mc="http://schemas.openxmlformats.org/markup-compatibility/2006" xmlns:aink="http://schemas.microsoft.com/office/drawing/2016/ink" xmlns:am3d="http://schemas.microsoft.com/office/drawing/2017/model3d" xmlns:o="urn:schemas-microsoft-com:office:office" xmlns:r="http://schemas.openxmlformats.org/officeDocument/2006/relationships" xmlns:m="http://schemas.openxmlformats.org/officeDocument/2006/math" xmlns:v="urn:schemas-microsoft-com:vml" xmlns:wp14="http://schemas.microsoft.com/office/word/2010/wordprocessingDrawing" xmlns:wp="http://schemas.openxmlformats.org/drawingml/2006/wordprocessingDrawing" xmlns:w10="urn:schemas-microsoft-com:office:word" xmlns:w="http://schemas.openxmlformats.org/wordprocessingml/2006/main" xmlns:w14="http://schemas.microsoft.com/office/word/2010/wordml" xmlns:w15="http://schemas.microsoft.com/office/word/2012/wordml" xmlns:w16cex="http://schemas.microsoft.com/office/word/2018/wordml/cex" xmlns:w16cid="http://schemas.microsoft.com/office/word/2016/wordml/cid" xmlns:w16="http://schemas.microsoft.com/office/word/2018/wordml" xmlns:w16se="http://schemas.microsoft.com/office/word/2015/wordml/symex" xmlns:wpg="http://schemas.microsoft.com/office/word/2010/wordprocessingGroup" xmlns:wpi="http://schemas.microsoft.com/office/word/2010/wordprocessingInk" xmlns:wne="http://schemas.microsoft.com/office/word/2006/wordml" xmlns:wps="http://schemas.microsoft.com/office/word/2010/wordprocessingShape" mc:Ignorable="w14 w15 w16se w16cid w16 w16cex wp14">
+<w15:commentsEx xmlns:wpc="http://schemas.microsoft.com/office/word/2010/wordprocessingCanvas" xmlns:cx="http://schemas.microsoft.com/office/drawing/2014/chartex" xmlns:cx1="http://schemas.microsoft.com/office/drawing/2015/9/8/chartex" xmlns:cx2="http://schemas.microsoft.com/office/drawing/2015/10/21/chartex" xmlns:cx3="http://schemas.microsoft.com/office/drawing/2016/5/9/chartex" xmlns:cx4="http://schemas.microsoft.com/office/drawing/2016/5/10/chartex" xmlns:cx5="http://schemas.microsoft.com/office/drawing/2016/5/11/chartex" xmlns:cx6="http://schemas.microsoft.com/office/drawing/2016/5/12/chartex" xmlns:cx7="http://schemas.microsoft.com/office/drawing/2016/5/13/chartex" xmlns:cx8="http://schemas.microsoft.com/office/drawing/2016/5/14/chartex" xmlns:mc="http://schemas.openxmlformats.org/markup-compatibility/2006" xmlns:aink="http://schemas.microsoft.com/office/drawing/2016/ink" xmlns:am3d="http://schemas.microsoft.com/office/drawing/2017/model3d" xmlns:o="urn:schemas-microsoft-com:office:office" xmlns:r="http://schemas.openxmlformats.org/officeDocument/2006/relationships" xmlns:m="http://schemas.openxmlformats.org/officeDocument/2006/math" xmlns:v="urn:schemas-microsoft-com:vml" xmlns:wp14="http://schemas.microsoft.com/office/word/2010/wordprocessingDrawing" xmlns:wp="http://schemas.openxmlformats.org/drawingml/2006/wordprocessingDrawing" xmlns:w10="urn:schemas-microsoft-com:office:word" xmlns:w="http://schemas.openxmlformats.org/wordprocessingml/2006/main" xmlns:w14="http://schemas.microsoft.com/office/word/2010/wordml" xmlns:w15="http://schemas.microsoft.com/office/word/2012/wordml" xmlns:w16cex="http://schemas.microsoft.com/office/word/2018/wordml/cex" xmlns:w16cid="http://schemas.microsoft.com/office/word/2016/wordml/cid" xmlns:w16="http://schemas.microsoft.com/office/word/2018/wordml" xmlns:w16sdtdh="http://schemas.microsoft.com/office/word/2020/wordml/sdtdatahash" xmlns:w16se="http://schemas.microsoft.com/office/word/2015/wordml/symex" xmlns:wpg="http://schemas.microsoft.com/office/word/2010/wordprocessingGroup" xmlns:wpi="http://schemas.microsoft.com/office/word/2010/wordprocessingInk" xmlns:wne="http://schemas.microsoft.com/office/word/2006/wordml" xmlns:wps="http://schemas.microsoft.com/office/word/2010/wordprocessingShape" mc:Ignorable="w14 w15 w16se w16cid w16 w16cex w16sdtdh wp14">
   <w15:commentEx w15:paraId="48D67C3C" w15:done="0"/>
   <w15:commentEx w15:paraId="20BB8491" w15:done="0"/>
   <w15:commentEx w15:paraId="71B369AE" w15:done="0"/>
@@ -9056,7 +8810,7 @@
 </file>
 
 <file path=word/commentsExtensible.xml><?xml version="1.0" encoding="utf-8"?>
-<w16cex:commentsExtensible xmlns:wpc="http://schemas.microsoft.com/office/word/2010/wordprocessingCanvas" xmlns:cx="http://schemas.microsoft.com/office/drawing/2014/chartex" xmlns:cx1="http://schemas.microsoft.com/office/drawing/2015/9/8/chartex" xmlns:cx2="http://schemas.microsoft.com/office/drawing/2015/10/21/chartex" xmlns:cx3="http://schemas.microsoft.com/office/drawing/2016/5/9/chartex" xmlns:cx4="http://schemas.microsoft.com/office/drawing/2016/5/10/chartex" xmlns:cx5="http://schemas.microsoft.com/office/drawing/2016/5/11/chartex" xmlns:cx6="http://schemas.microsoft.com/office/drawing/2016/5/12/chartex" xmlns:cx7="http://schemas.microsoft.com/office/drawing/2016/5/13/chartex" xmlns:cx8="http://schemas.microsoft.com/office/drawing/2016/5/14/chartex" xmlns:mc="http://schemas.openxmlformats.org/markup-compatibility/2006" xmlns:aink="http://schemas.microsoft.com/office/drawing/2016/ink" xmlns:am3d="http://schemas.microsoft.com/office/drawing/2017/model3d" xmlns:o="urn:schemas-microsoft-com:office:office" xmlns:r="http://schemas.openxmlformats.org/officeDocument/2006/relationships" xmlns:m="http://schemas.openxmlformats.org/officeDocument/2006/math" xmlns:v="urn:schemas-microsoft-com:vml" xmlns:wp14="http://schemas.microsoft.com/office/word/2010/wordprocessingDrawing" xmlns:wp="http://schemas.openxmlformats.org/drawingml/2006/wordprocessingDrawing" xmlns:w10="urn:schemas-microsoft-com:office:word" xmlns:w="http://schemas.openxmlformats.org/wordprocessingml/2006/main" xmlns:w14="http://schemas.microsoft.com/office/word/2010/wordml" xmlns:w15="http://schemas.microsoft.com/office/word/2012/wordml" xmlns:w16cex="http://schemas.microsoft.com/office/word/2018/wordml/cex" xmlns:w16cid="http://schemas.microsoft.com/office/word/2016/wordml/cid" xmlns:w16="http://schemas.microsoft.com/office/word/2018/wordml" xmlns:w16se="http://schemas.microsoft.com/office/word/2015/wordml/symex" xmlns:wpg="http://schemas.microsoft.com/office/word/2010/wordprocessingGroup" xmlns:wpi="http://schemas.microsoft.com/office/word/2010/wordprocessingInk" xmlns:wne="http://schemas.microsoft.com/office/word/2006/wordml" xmlns:wps="http://schemas.microsoft.com/office/word/2010/wordprocessingShape" mc:Ignorable="w14 w15 w16se w16cid w16 w16cex wp14">
+<w16cex:commentsExtensible xmlns:wpc="http://schemas.microsoft.com/office/word/2010/wordprocessingCanvas" xmlns:cx="http://schemas.microsoft.com/office/drawing/2014/chartex" xmlns:cx1="http://schemas.microsoft.com/office/drawing/2015/9/8/chartex" xmlns:cx2="http://schemas.microsoft.com/office/drawing/2015/10/21/chartex" xmlns:cx3="http://schemas.microsoft.com/office/drawing/2016/5/9/chartex" xmlns:cx4="http://schemas.microsoft.com/office/drawing/2016/5/10/chartex" xmlns:cx5="http://schemas.microsoft.com/office/drawing/2016/5/11/chartex" xmlns:cx6="http://schemas.microsoft.com/office/drawing/2016/5/12/chartex" xmlns:cx7="http://schemas.microsoft.com/office/drawing/2016/5/13/chartex" xmlns:cx8="http://schemas.microsoft.com/office/drawing/2016/5/14/chartex" xmlns:mc="http://schemas.openxmlformats.org/markup-compatibility/2006" xmlns:aink="http://schemas.microsoft.com/office/drawing/2016/ink" xmlns:am3d="http://schemas.microsoft.com/office/drawing/2017/model3d" xmlns:o="urn:schemas-microsoft-com:office:office" xmlns:r="http://schemas.openxmlformats.org/officeDocument/2006/relationships" xmlns:m="http://schemas.openxmlformats.org/officeDocument/2006/math" xmlns:v="urn:schemas-microsoft-com:vml" xmlns:wp14="http://schemas.microsoft.com/office/word/2010/wordprocessingDrawing" xmlns:wp="http://schemas.openxmlformats.org/drawingml/2006/wordprocessingDrawing" xmlns:w10="urn:schemas-microsoft-com:office:word" xmlns:w="http://schemas.openxmlformats.org/wordprocessingml/2006/main" xmlns:w14="http://schemas.microsoft.com/office/word/2010/wordml" xmlns:w15="http://schemas.microsoft.com/office/word/2012/wordml" xmlns:w16cex="http://schemas.microsoft.com/office/word/2018/wordml/cex" xmlns:w16cid="http://schemas.microsoft.com/office/word/2016/wordml/cid" xmlns:w16="http://schemas.microsoft.com/office/word/2018/wordml" xmlns:w16sdtdh="http://schemas.microsoft.com/office/word/2020/wordml/sdtdatahash" xmlns:w16se="http://schemas.microsoft.com/office/word/2015/wordml/symex" xmlns:wpg="http://schemas.microsoft.com/office/word/2010/wordprocessingGroup" xmlns:wpi="http://schemas.microsoft.com/office/word/2010/wordprocessingInk" xmlns:wne="http://schemas.microsoft.com/office/word/2006/wordml" xmlns:wps="http://schemas.microsoft.com/office/word/2010/wordprocessingShape" mc:Ignorable="w14 w15 w16se w16cid w16 w16cex w16sdtdh wp14">
   <w16cex:commentExtensible w16cex:durableId="2CC58D8E" w16cex:dateUtc="2025-11-17T18:03:00Z"/>
   <w16cex:commentExtensible w16cex:durableId="2CC58DFD" w16cex:dateUtc="2025-11-17T18:05:00Z"/>
   <w16cex:commentExtensible w16cex:durableId="2CC5907B" w16cex:dateUtc="2025-11-17T18:15:00Z"/>
@@ -9069,7 +8823,7 @@
 </file>
 
 <file path=word/commentsIds.xml><?xml version="1.0" encoding="utf-8"?>
-<w16cid:commentsIds xmlns:wpc="http://schemas.microsoft.com/office/word/2010/wordprocessingCanvas" xmlns:cx="http://schemas.microsoft.com/office/drawing/2014/chartex" xmlns:cx1="http://schemas.microsoft.com/office/drawing/2015/9/8/chartex" xmlns:cx2="http://schemas.microsoft.com/office/drawing/2015/10/21/chartex" xmlns:cx3="http://schemas.microsoft.com/office/drawing/2016/5/9/chartex" xmlns:cx4="http://schemas.microsoft.com/office/drawing/2016/5/10/chartex" xmlns:cx5="http://schemas.microsoft.com/office/drawing/2016/5/11/chartex" xmlns:cx6="http://schemas.microsoft.com/office/drawing/2016/5/12/chartex" xmlns:cx7="http://schemas.microsoft.com/office/drawing/2016/5/13/chartex" xmlns:cx8="http://schemas.microsoft.com/office/drawing/2016/5/14/chartex" xmlns:mc="http://schemas.openxmlformats.org/markup-compatibility/2006" xmlns:aink="http://schemas.microsoft.com/office/drawing/2016/ink" xmlns:am3d="http://schemas.microsoft.com/office/drawing/2017/model3d" xmlns:o="urn:schemas-microsoft-com:office:office" xmlns:r="http://schemas.openxmlformats.org/officeDocument/2006/relationships" xmlns:m="http://schemas.openxmlformats.org/officeDocument/2006/math" xmlns:v="urn:schemas-microsoft-com:vml" xmlns:wp14="http://schemas.microsoft.com/office/word/2010/wordprocessingDrawing" xmlns:wp="http://schemas.openxmlformats.org/drawingml/2006/wordprocessingDrawing" xmlns:w10="urn:schemas-microsoft-com:office:word" xmlns:w="http://schemas.openxmlformats.org/wordprocessingml/2006/main" xmlns:w14="http://schemas.microsoft.com/office/word/2010/wordml" xmlns:w15="http://schemas.microsoft.com/office/word/2012/wordml" xmlns:w16cex="http://schemas.microsoft.com/office/word/2018/wordml/cex" xmlns:w16cid="http://schemas.microsoft.com/office/word/2016/wordml/cid" xmlns:w16="http://schemas.microsoft.com/office/word/2018/wordml" xmlns:w16se="http://schemas.microsoft.com/office/word/2015/wordml/symex" xmlns:wpg="http://schemas.microsoft.com/office/word/2010/wordprocessingGroup" xmlns:wpi="http://schemas.microsoft.com/office/word/2010/wordprocessingInk" xmlns:wne="http://schemas.microsoft.com/office/word/2006/wordml" xmlns:wps="http://schemas.microsoft.com/office/word/2010/wordprocessingShape" mc:Ignorable="w14 w15 w16se w16cid w16 w16cex wp14">
+<w16cid:commentsIds xmlns:wpc="http://schemas.microsoft.com/office/word/2010/wordprocessingCanvas" xmlns:cx="http://schemas.microsoft.com/office/drawing/2014/chartex" xmlns:cx1="http://schemas.microsoft.com/office/drawing/2015/9/8/chartex" xmlns:cx2="http://schemas.microsoft.com/office/drawing/2015/10/21/chartex" xmlns:cx3="http://schemas.microsoft.com/office/drawing/2016/5/9/chartex" xmlns:cx4="http://schemas.microsoft.com/office/drawing/2016/5/10/chartex" xmlns:cx5="http://schemas.microsoft.com/office/drawing/2016/5/11/chartex" xmlns:cx6="http://schemas.microsoft.com/office/drawing/2016/5/12/chartex" xmlns:cx7="http://schemas.microsoft.com/office/drawing/2016/5/13/chartex" xmlns:cx8="http://schemas.microsoft.com/office/drawing/2016/5/14/chartex" xmlns:mc="http://schemas.openxmlformats.org/markup-compatibility/2006" xmlns:aink="http://schemas.microsoft.com/office/drawing/2016/ink" xmlns:am3d="http://schemas.microsoft.com/office/drawing/2017/model3d" xmlns:o="urn:schemas-microsoft-com:office:office" xmlns:r="http://schemas.openxmlformats.org/officeDocument/2006/relationships" xmlns:m="http://schemas.openxmlformats.org/officeDocument/2006/math" xmlns:v="urn:schemas-microsoft-com:vml" xmlns:wp14="http://schemas.microsoft.com/office/word/2010/wordprocessingDrawing" xmlns:wp="http://schemas.openxmlformats.org/drawingml/2006/wordprocessingDrawing" xmlns:w10="urn:schemas-microsoft-com:office:word" xmlns:w="http://schemas.openxmlformats.org/wordprocessingml/2006/main" xmlns:w14="http://schemas.microsoft.com/office/word/2010/wordml" xmlns:w15="http://schemas.microsoft.com/office/word/2012/wordml" xmlns:w16cex="http://schemas.microsoft.com/office/word/2018/wordml/cex" xmlns:w16cid="http://schemas.microsoft.com/office/word/2016/wordml/cid" xmlns:w16="http://schemas.microsoft.com/office/word/2018/wordml" xmlns:w16sdtdh="http://schemas.microsoft.com/office/word/2020/wordml/sdtdatahash" xmlns:w16se="http://schemas.microsoft.com/office/word/2015/wordml/symex" xmlns:wpg="http://schemas.microsoft.com/office/word/2010/wordprocessingGroup" xmlns:wpi="http://schemas.microsoft.com/office/word/2010/wordprocessingInk" xmlns:wne="http://schemas.microsoft.com/office/word/2006/wordml" xmlns:wps="http://schemas.microsoft.com/office/word/2010/wordprocessingShape" mc:Ignorable="w14 w15 w16se w16cid w16 w16cex w16sdtdh wp14">
   <w16cid:commentId w16cid:paraId="48D67C3C" w16cid:durableId="2CC58D8E"/>
   <w16cid:commentId w16cid:paraId="20BB8491" w16cid:durableId="2CC58DFD"/>
   <w16cid:commentId w16cid:paraId="71B369AE" w16cid:durableId="2CC5907B"/>
@@ -9082,7 +8836,7 @@
 </file>
 
 <file path=word/endnotes.xml><?xml version="1.0" encoding="utf-8"?>
-<w:endnotes xmlns:wpc="http://schemas.microsoft.com/office/word/2010/wordprocessingCanvas" xmlns:cx="http://schemas.microsoft.com/office/drawing/2014/chartex" xmlns:cx1="http://schemas.microsoft.com/office/drawing/2015/9/8/chartex" xmlns:cx2="http://schemas.microsoft.com/office/drawing/2015/10/21/chartex" xmlns:cx3="http://schemas.microsoft.com/office/drawing/2016/5/9/chartex" xmlns:cx4="http://schemas.microsoft.com/office/drawing/2016/5/10/chartex" xmlns:cx5="http://schemas.microsoft.com/office/drawing/2016/5/11/chartex" xmlns:cx6="http://schemas.microsoft.com/office/drawing/2016/5/12/chartex" xmlns:cx7="http://schemas.microsoft.com/office/drawing/2016/5/13/chartex" xmlns:cx8="http://schemas.microsoft.com/office/drawing/2016/5/14/chartex" xmlns:mc="http://schemas.openxmlformats.org/markup-compatibility/2006" xmlns:aink="http://schemas.microsoft.com/office/drawing/2016/ink" xmlns:am3d="http://schemas.microsoft.com/office/drawing/2017/model3d" xmlns:o="urn:schemas-microsoft-com:office:office" xmlns:r="http://schemas.openxmlformats.org/officeDocument/2006/relationships" xmlns:m="http://schemas.openxmlformats.org/officeDocument/2006/math" xmlns:v="urn:schemas-microsoft-com:vml" xmlns:wp14="http://schemas.microsoft.com/office/word/2010/wordprocessingDrawing" xmlns:wp="http://schemas.openxmlformats.org/drawingml/2006/wordprocessingDrawing" xmlns:w10="urn:schemas-microsoft-com:office:word" xmlns:w="http://schemas.openxmlformats.org/wordprocessingml/2006/main" xmlns:w14="http://schemas.microsoft.com/office/word/2010/wordml" xmlns:w15="http://schemas.microsoft.com/office/word/2012/wordml" xmlns:w16cex="http://schemas.microsoft.com/office/word/2018/wordml/cex" xmlns:w16cid="http://schemas.microsoft.com/office/word/2016/wordml/cid" xmlns:w16="http://schemas.microsoft.com/office/word/2018/wordml" xmlns:w16se="http://schemas.microsoft.com/office/word/2015/wordml/symex" xmlns:wpg="http://schemas.microsoft.com/office/word/2010/wordprocessingGroup" xmlns:wpi="http://schemas.microsoft.com/office/word/2010/wordprocessingInk" xmlns:wne="http://schemas.microsoft.com/office/word/2006/wordml" xmlns:wps="http://schemas.microsoft.com/office/word/2010/wordprocessingShape" mc:Ignorable="w14 w15 w16se w16cid w16 w16cex wp14">
+<w:endnotes xmlns:wpc="http://schemas.microsoft.com/office/word/2010/wordprocessingCanvas" xmlns:cx="http://schemas.microsoft.com/office/drawing/2014/chartex" xmlns:cx1="http://schemas.microsoft.com/office/drawing/2015/9/8/chartex" xmlns:cx2="http://schemas.microsoft.com/office/drawing/2015/10/21/chartex" xmlns:cx3="http://schemas.microsoft.com/office/drawing/2016/5/9/chartex" xmlns:cx4="http://schemas.microsoft.com/office/drawing/2016/5/10/chartex" xmlns:cx5="http://schemas.microsoft.com/office/drawing/2016/5/11/chartex" xmlns:cx6="http://schemas.microsoft.com/office/drawing/2016/5/12/chartex" xmlns:cx7="http://schemas.microsoft.com/office/drawing/2016/5/13/chartex" xmlns:cx8="http://schemas.microsoft.com/office/drawing/2016/5/14/chartex" xmlns:mc="http://schemas.openxmlformats.org/markup-compatibility/2006" xmlns:aink="http://schemas.microsoft.com/office/drawing/2016/ink" xmlns:am3d="http://schemas.microsoft.com/office/drawing/2017/model3d" xmlns:o="urn:schemas-microsoft-com:office:office" xmlns:r="http://schemas.openxmlformats.org/officeDocument/2006/relationships" xmlns:m="http://schemas.openxmlformats.org/officeDocument/2006/math" xmlns:v="urn:schemas-microsoft-com:vml" xmlns:wp14="http://schemas.microsoft.com/office/word/2010/wordprocessingDrawing" xmlns:wp="http://schemas.openxmlformats.org/drawingml/2006/wordprocessingDrawing" xmlns:w10="urn:schemas-microsoft-com:office:word" xmlns:w="http://schemas.openxmlformats.org/wordprocessingml/2006/main" xmlns:w14="http://schemas.microsoft.com/office/word/2010/wordml" xmlns:w15="http://schemas.microsoft.com/office/word/2012/wordml" xmlns:w16cex="http://schemas.microsoft.com/office/word/2018/wordml/cex" xmlns:w16cid="http://schemas.microsoft.com/office/word/2016/wordml/cid" xmlns:w16="http://schemas.microsoft.com/office/word/2018/wordml" xmlns:w16sdtdh="http://schemas.microsoft.com/office/word/2020/wordml/sdtdatahash" xmlns:w16se="http://schemas.microsoft.com/office/word/2015/wordml/symex" xmlns:wpg="http://schemas.microsoft.com/office/word/2010/wordprocessingGroup" xmlns:wpi="http://schemas.microsoft.com/office/word/2010/wordprocessingInk" xmlns:wne="http://schemas.microsoft.com/office/word/2006/wordml" xmlns:wps="http://schemas.microsoft.com/office/word/2010/wordprocessingShape" mc:Ignorable="w14 w15 w16se w16cid w16 w16cex w16sdtdh wp14">
   <w:endnote w:type="separator" w:id="-1">
     <w:p>
       <w:pPr>
@@ -9107,7 +8861,7 @@
 </file>
 
 <file path=word/footnotes.xml><?xml version="1.0" encoding="utf-8"?>
-<w:footnotes xmlns:wpc="http://schemas.microsoft.com/office/word/2010/wordprocessingCanvas" xmlns:cx="http://schemas.microsoft.com/office/drawing/2014/chartex" xmlns:cx1="http://schemas.microsoft.com/office/drawing/2015/9/8/chartex" xmlns:cx2="http://schemas.microsoft.com/office/drawing/2015/10/21/chartex" xmlns:cx3="http://schemas.microsoft.com/office/drawing/2016/5/9/chartex" xmlns:cx4="http://schemas.microsoft.com/office/drawing/2016/5/10/chartex" xmlns:cx5="http://schemas.microsoft.com/office/drawing/2016/5/11/chartex" xmlns:cx6="http://schemas.microsoft.com/office/drawing/2016/5/12/chartex" xmlns:cx7="http://schemas.microsoft.com/office/drawing/2016/5/13/chartex" xmlns:cx8="http://schemas.microsoft.com/office/drawing/2016/5/14/chartex" xmlns:mc="http://schemas.openxmlformats.org/markup-compatibility/2006" xmlns:aink="http://schemas.microsoft.com/office/drawing/2016/ink" xmlns:am3d="http://schemas.microsoft.com/office/drawing/2017/model3d" xmlns:o="urn:schemas-microsoft-com:office:office" xmlns:r="http://schemas.openxmlformats.org/officeDocument/2006/relationships" xmlns:m="http://schemas.openxmlformats.org/officeDocument/2006/math" xmlns:v="urn:schemas-microsoft-com:vml" xmlns:wp14="http://schemas.microsoft.com/office/word/2010/wordprocessingDrawing" xmlns:wp="http://schemas.openxmlformats.org/drawingml/2006/wordprocessingDrawing" xmlns:w10="urn:schemas-microsoft-com:office:word" xmlns:w="http://schemas.openxmlformats.org/wordprocessingml/2006/main" xmlns:w14="http://schemas.microsoft.com/office/word/2010/wordml" xmlns:w15="http://schemas.microsoft.com/office/word/2012/wordml" xmlns:w16cex="http://schemas.microsoft.com/office/word/2018/wordml/cex" xmlns:w16cid="http://schemas.microsoft.com/office/word/2016/wordml/cid" xmlns:w16="http://schemas.microsoft.com/office/word/2018/wordml" xmlns:w16se="http://schemas.microsoft.com/office/word/2015/wordml/symex" xmlns:wpg="http://schemas.microsoft.com/office/word/2010/wordprocessingGroup" xmlns:wpi="http://schemas.microsoft.com/office/word/2010/wordprocessingInk" xmlns:wne="http://schemas.microsoft.com/office/word/2006/wordml" xmlns:wps="http://schemas.microsoft.com/office/word/2010/wordprocessingShape" mc:Ignorable="w14 w15 w16se w16cid w16 w16cex wp14">
+<w:footnotes xmlns:wpc="http://schemas.microsoft.com/office/word/2010/wordprocessingCanvas" xmlns:cx="http://schemas.microsoft.com/office/drawing/2014/chartex" xmlns:cx1="http://schemas.microsoft.com/office/drawing/2015/9/8/chartex" xmlns:cx2="http://schemas.microsoft.com/office/drawing/2015/10/21/chartex" xmlns:cx3="http://schemas.microsoft.com/office/drawing/2016/5/9/chartex" xmlns:cx4="http://schemas.microsoft.com/office/drawing/2016/5/10/chartex" xmlns:cx5="http://schemas.microsoft.com/office/drawing/2016/5/11/chartex" xmlns:cx6="http://schemas.microsoft.com/office/drawing/2016/5/12/chartex" xmlns:cx7="http://schemas.microsoft.com/office/drawing/2016/5/13/chartex" xmlns:cx8="http://schemas.microsoft.com/office/drawing/2016/5/14/chartex" xmlns:mc="http://schemas.openxmlformats.org/markup-compatibility/2006" xmlns:aink="http://schemas.microsoft.com/office/drawing/2016/ink" xmlns:am3d="http://schemas.microsoft.com/office/drawing/2017/model3d" xmlns:o="urn:schemas-microsoft-com:office:office" xmlns:r="http://schemas.openxmlformats.org/officeDocument/2006/relationships" xmlns:m="http://schemas.openxmlformats.org/officeDocument/2006/math" xmlns:v="urn:schemas-microsoft-com:vml" xmlns:wp14="http://schemas.microsoft.com/office/word/2010/wordprocessingDrawing" xmlns:wp="http://schemas.openxmlformats.org/drawingml/2006/wordprocessingDrawing" xmlns:w10="urn:schemas-microsoft-com:office:word" xmlns:w="http://schemas.openxmlformats.org/wordprocessingml/2006/main" xmlns:w14="http://schemas.microsoft.com/office/word/2010/wordml" xmlns:w15="http://schemas.microsoft.com/office/word/2012/wordml" xmlns:w16cex="http://schemas.microsoft.com/office/word/2018/wordml/cex" xmlns:w16cid="http://schemas.microsoft.com/office/word/2016/wordml/cid" xmlns:w16="http://schemas.microsoft.com/office/word/2018/wordml" xmlns:w16sdtdh="http://schemas.microsoft.com/office/word/2020/wordml/sdtdatahash" xmlns:w16se="http://schemas.microsoft.com/office/word/2015/wordml/symex" xmlns:wpg="http://schemas.microsoft.com/office/word/2010/wordprocessingGroup" xmlns:wpi="http://schemas.microsoft.com/office/word/2010/wordprocessingInk" xmlns:wne="http://schemas.microsoft.com/office/word/2006/wordml" xmlns:wps="http://schemas.microsoft.com/office/word/2010/wordprocessingShape" mc:Ignorable="w14 w15 w16se w16cid w16 w16cex w16sdtdh wp14">
   <w:footnote w:type="separator" w:id="-1">
     <w:p>
       <w:pPr>
@@ -9132,7 +8886,7 @@
 </file>
 
 <file path=word/numbering.xml><?xml version="1.0" encoding="utf-8"?>
-<w:numbering xmlns:wpc="http://schemas.microsoft.com/office/word/2010/wordprocessingCanvas" xmlns:cx="http://schemas.microsoft.com/office/drawing/2014/chartex" xmlns:cx1="http://schemas.microsoft.com/office/drawing/2015/9/8/chartex" xmlns:cx2="http://schemas.microsoft.com/office/drawing/2015/10/21/chartex" xmlns:cx3="http://schemas.microsoft.com/office/drawing/2016/5/9/chartex" xmlns:cx4="http://schemas.microsoft.com/office/drawing/2016/5/10/chartex" xmlns:cx5="http://schemas.microsoft.com/office/drawing/2016/5/11/chartex" xmlns:cx6="http://schemas.microsoft.com/office/drawing/2016/5/12/chartex" xmlns:cx7="http://schemas.microsoft.com/office/drawing/2016/5/13/chartex" xmlns:cx8="http://schemas.microsoft.com/office/drawing/2016/5/14/chartex" xmlns:mc="http://schemas.openxmlformats.org/markup-compatibility/2006" xmlns:aink="http://schemas.microsoft.com/office/drawing/2016/ink" xmlns:am3d="http://schemas.microsoft.com/office/drawing/2017/model3d" xmlns:o="urn:schemas-microsoft-com:office:office" xmlns:r="http://schemas.openxmlformats.org/officeDocument/2006/relationships" xmlns:m="http://schemas.openxmlformats.org/officeDocument/2006/math" xmlns:v="urn:schemas-microsoft-com:vml" xmlns:wp14="http://schemas.microsoft.com/office/word/2010/wordprocessingDrawing" xmlns:wp="http://schemas.openxmlformats.org/drawingml/2006/wordprocessingDrawing" xmlns:w10="urn:schemas-microsoft-com:office:word" xmlns:w="http://schemas.openxmlformats.org/wordprocessingml/2006/main" xmlns:w14="http://schemas.microsoft.com/office/word/2010/wordml" xmlns:w15="http://schemas.microsoft.com/office/word/2012/wordml" xmlns:w16cex="http://schemas.microsoft.com/office/word/2018/wordml/cex" xmlns:w16cid="http://schemas.microsoft.com/office/word/2016/wordml/cid" xmlns:w16="http://schemas.microsoft.com/office/word/2018/wordml" xmlns:w16se="http://schemas.microsoft.com/office/word/2015/wordml/symex" xmlns:wpg="http://schemas.microsoft.com/office/word/2010/wordprocessingGroup" xmlns:wpi="http://schemas.microsoft.com/office/word/2010/wordprocessingInk" xmlns:wne="http://schemas.microsoft.com/office/word/2006/wordml" xmlns:wps="http://schemas.microsoft.com/office/word/2010/wordprocessingShape" mc:Ignorable="w14 w15 w16se w16cid w16 w16cex wp14">
+<w:numbering xmlns:wpc="http://schemas.microsoft.com/office/word/2010/wordprocessingCanvas" xmlns:cx="http://schemas.microsoft.com/office/drawing/2014/chartex" xmlns:cx1="http://schemas.microsoft.com/office/drawing/2015/9/8/chartex" xmlns:cx2="http://schemas.microsoft.com/office/drawing/2015/10/21/chartex" xmlns:cx3="http://schemas.microsoft.com/office/drawing/2016/5/9/chartex" xmlns:cx4="http://schemas.microsoft.com/office/drawing/2016/5/10/chartex" xmlns:cx5="http://schemas.microsoft.com/office/drawing/2016/5/11/chartex" xmlns:cx6="http://schemas.microsoft.com/office/drawing/2016/5/12/chartex" xmlns:cx7="http://schemas.microsoft.com/office/drawing/2016/5/13/chartex" xmlns:cx8="http://schemas.microsoft.com/office/drawing/2016/5/14/chartex" xmlns:mc="http://schemas.openxmlformats.org/markup-compatibility/2006" xmlns:aink="http://schemas.microsoft.com/office/drawing/2016/ink" xmlns:am3d="http://schemas.microsoft.com/office/drawing/2017/model3d" xmlns:o="urn:schemas-microsoft-com:office:office" xmlns:r="http://schemas.openxmlformats.org/officeDocument/2006/relationships" xmlns:m="http://schemas.openxmlformats.org/officeDocument/2006/math" xmlns:v="urn:schemas-microsoft-com:vml" xmlns:wp14="http://schemas.microsoft.com/office/word/2010/wordprocessingDrawing" xmlns:wp="http://schemas.openxmlformats.org/drawingml/2006/wordprocessingDrawing" xmlns:w10="urn:schemas-microsoft-com:office:word" xmlns:w="http://schemas.openxmlformats.org/wordprocessingml/2006/main" xmlns:w14="http://schemas.microsoft.com/office/word/2010/wordml" xmlns:w15="http://schemas.microsoft.com/office/word/2012/wordml" xmlns:w16cex="http://schemas.microsoft.com/office/word/2018/wordml/cex" xmlns:w16cid="http://schemas.microsoft.com/office/word/2016/wordml/cid" xmlns:w16="http://schemas.microsoft.com/office/word/2018/wordml" xmlns:w16sdtdh="http://schemas.microsoft.com/office/word/2020/wordml/sdtdatahash" xmlns:w16se="http://schemas.microsoft.com/office/word/2015/wordml/symex" xmlns:wpg="http://schemas.microsoft.com/office/word/2010/wordprocessingGroup" xmlns:wpi="http://schemas.microsoft.com/office/word/2010/wordprocessingInk" xmlns:wne="http://schemas.microsoft.com/office/word/2006/wordml" xmlns:wps="http://schemas.microsoft.com/office/word/2010/wordprocessingShape" mc:Ignorable="w14 w15 w16se w16cid w16 w16cex w16sdtdh wp14">
   <w:abstractNum w:abstractNumId="0" w15:restartNumberingAfterBreak="0">
     <w:nsid w:val="0145594E"/>
     <w:multiLevelType w:val="hybridMultilevel"/>
@@ -12656,7 +12410,7 @@
 </file>
 
 <file path=word/people.xml><?xml version="1.0" encoding="utf-8"?>
-<w15:people xmlns:wpc="http://schemas.microsoft.com/office/word/2010/wordprocessingCanvas" xmlns:cx="http://schemas.microsoft.com/office/drawing/2014/chartex" xmlns:cx1="http://schemas.microsoft.com/office/drawing/2015/9/8/chartex" xmlns:cx2="http://schemas.microsoft.com/office/drawing/2015/10/21/chartex" xmlns:cx3="http://schemas.microsoft.com/office/drawing/2016/5/9/chartex" xmlns:cx4="http://schemas.microsoft.com/office/drawing/2016/5/10/chartex" xmlns:cx5="http://schemas.microsoft.com/office/drawing/2016/5/11/chartex" xmlns:cx6="http://schemas.microsoft.com/office/drawing/2016/5/12/chartex" xmlns:cx7="http://schemas.microsoft.com/office/drawing/2016/5/13/chartex" xmlns:cx8="http://schemas.microsoft.com/office/drawing/2016/5/14/chartex" xmlns:mc="http://schemas.openxmlformats.org/markup-compatibility/2006" xmlns:aink="http://schemas.microsoft.com/office/drawing/2016/ink" xmlns:am3d="http://schemas.microsoft.com/office/drawing/2017/model3d" xmlns:o="urn:schemas-microsoft-com:office:office" xmlns:r="http://schemas.openxmlformats.org/officeDocument/2006/relationships" xmlns:m="http://schemas.openxmlformats.org/officeDocument/2006/math" xmlns:v="urn:schemas-microsoft-com:vml" xmlns:wp14="http://schemas.microsoft.com/office/word/2010/wordprocessingDrawing" xmlns:wp="http://schemas.openxmlformats.org/drawingml/2006/wordprocessingDrawing" xmlns:w10="urn:schemas-microsoft-com:office:word" xmlns:w="http://schemas.openxmlformats.org/wordprocessingml/2006/main" xmlns:w14="http://schemas.microsoft.com/office/word/2010/wordml" xmlns:w15="http://schemas.microsoft.com/office/word/2012/wordml" xmlns:w16cex="http://schemas.microsoft.com/office/word/2018/wordml/cex" xmlns:w16cid="http://schemas.microsoft.com/office/word/2016/wordml/cid" xmlns:w16="http://schemas.microsoft.com/office/word/2018/wordml" xmlns:w16se="http://schemas.microsoft.com/office/word/2015/wordml/symex" xmlns:wpg="http://schemas.microsoft.com/office/word/2010/wordprocessingGroup" xmlns:wpi="http://schemas.microsoft.com/office/word/2010/wordprocessingInk" xmlns:wne="http://schemas.microsoft.com/office/word/2006/wordml" xmlns:wps="http://schemas.microsoft.com/office/word/2010/wordprocessingShape" mc:Ignorable="w14 w15 w16se w16cid w16 w16cex wp14">
+<w15:people xmlns:wpc="http://schemas.microsoft.com/office/word/2010/wordprocessingCanvas" xmlns:cx="http://schemas.microsoft.com/office/drawing/2014/chartex" xmlns:cx1="http://schemas.microsoft.com/office/drawing/2015/9/8/chartex" xmlns:cx2="http://schemas.microsoft.com/office/drawing/2015/10/21/chartex" xmlns:cx3="http://schemas.microsoft.com/office/drawing/2016/5/9/chartex" xmlns:cx4="http://schemas.microsoft.com/office/drawing/2016/5/10/chartex" xmlns:cx5="http://schemas.microsoft.com/office/drawing/2016/5/11/chartex" xmlns:cx6="http://schemas.microsoft.com/office/drawing/2016/5/12/chartex" xmlns:cx7="http://schemas.microsoft.com/office/drawing/2016/5/13/chartex" xmlns:cx8="http://schemas.microsoft.com/office/drawing/2016/5/14/chartex" xmlns:mc="http://schemas.openxmlformats.org/markup-compatibility/2006" xmlns:aink="http://schemas.microsoft.com/office/drawing/2016/ink" xmlns:am3d="http://schemas.microsoft.com/office/drawing/2017/model3d" xmlns:o="urn:schemas-microsoft-com:office:office" xmlns:r="http://schemas.openxmlformats.org/officeDocument/2006/relationships" xmlns:m="http://schemas.openxmlformats.org/officeDocument/2006/math" xmlns:v="urn:schemas-microsoft-com:vml" xmlns:wp14="http://schemas.microsoft.com/office/word/2010/wordprocessingDrawing" xmlns:wp="http://schemas.openxmlformats.org/drawingml/2006/wordprocessingDrawing" xmlns:w10="urn:schemas-microsoft-com:office:word" xmlns:w="http://schemas.openxmlformats.org/wordprocessingml/2006/main" xmlns:w14="http://schemas.microsoft.com/office/word/2010/wordml" xmlns:w15="http://schemas.microsoft.com/office/word/2012/wordml" xmlns:w16cex="http://schemas.microsoft.com/office/word/2018/wordml/cex" xmlns:w16cid="http://schemas.microsoft.com/office/word/2016/wordml/cid" xmlns:w16="http://schemas.microsoft.com/office/word/2018/wordml" xmlns:w16sdtdh="http://schemas.microsoft.com/office/word/2020/wordml/sdtdatahash" xmlns:w16se="http://schemas.microsoft.com/office/word/2015/wordml/symex" xmlns:wpg="http://schemas.microsoft.com/office/word/2010/wordprocessingGroup" xmlns:wpi="http://schemas.microsoft.com/office/word/2010/wordprocessingInk" xmlns:wne="http://schemas.microsoft.com/office/word/2006/wordml" xmlns:wps="http://schemas.microsoft.com/office/word/2010/wordprocessingShape" mc:Ignorable="w14 w15 w16se w16cid w16 w16cex w16sdtdh wp14">
   <w15:person w15:author="Usuario">
     <w15:presenceInfo w15:providerId="None" w15:userId="Usuario"/>
   </w15:person>
@@ -12664,7 +12418,7 @@
 </file>
 
 <file path=word/styles.xml><?xml version="1.0" encoding="utf-8"?>
-<w:styles xmlns:mc="http://schemas.openxmlformats.org/markup-compatibility/2006" xmlns:r="http://schemas.openxmlformats.org/officeDocument/2006/relationships" xmlns:w="http://schemas.openxmlformats.org/wordprocessingml/2006/main" xmlns:w14="http://schemas.microsoft.com/office/word/2010/wordml" xmlns:w15="http://schemas.microsoft.com/office/word/2012/wordml" xmlns:w16cex="http://schemas.microsoft.com/office/word/2018/wordml/cex" xmlns:w16cid="http://schemas.microsoft.com/office/word/2016/wordml/cid" xmlns:w16="http://schemas.microsoft.com/office/word/2018/wordml" xmlns:w16se="http://schemas.microsoft.com/office/word/2015/wordml/symex" mc:Ignorable="w14 w15 w16se w16cid w16 w16cex">
+<w:styles xmlns:mc="http://schemas.openxmlformats.org/markup-compatibility/2006" xmlns:r="http://schemas.openxmlformats.org/officeDocument/2006/relationships" xmlns:w="http://schemas.openxmlformats.org/wordprocessingml/2006/main" xmlns:w14="http://schemas.microsoft.com/office/word/2010/wordml" xmlns:w15="http://schemas.microsoft.com/office/word/2012/wordml" xmlns:w16cex="http://schemas.microsoft.com/office/word/2018/wordml/cex" xmlns:w16cid="http://schemas.microsoft.com/office/word/2016/wordml/cid" xmlns:w16="http://schemas.microsoft.com/office/word/2018/wordml" xmlns:w16sdtdh="http://schemas.microsoft.com/office/word/2020/wordml/sdtdatahash" xmlns:w16se="http://schemas.microsoft.com/office/word/2015/wordml/symex" mc:Ignorable="w14 w15 w16se w16cid w16 w16cex w16sdtdh">
   <w:docDefaults>
     <w:rPrDefault>
       <w:rPr>
@@ -12786,7 +12540,6 @@
     <w:lsdException w:name="HTML Sample" w:semiHidden="1" w:unhideWhenUsed="1"/>
     <w:lsdException w:name="HTML Typewriter" w:semiHidden="1" w:unhideWhenUsed="1"/>
     <w:lsdException w:name="HTML Variable" w:semiHidden="1" w:unhideWhenUsed="1"/>
-    <w:lsdException w:name="Normal Table" w:semiHidden="1" w:unhideWhenUsed="1"/>
     <w:lsdException w:name="annotation subject" w:semiHidden="1" w:unhideWhenUsed="1"/>
     <w:lsdException w:name="No List" w:semiHidden="1" w:unhideWhenUsed="1"/>
     <w:lsdException w:name="Outline List 1" w:semiHidden="1" w:unhideWhenUsed="1"/>
@@ -12829,11 +12582,8 @@
     <w:lsdException w:name="Table Contemporary" w:semiHidden="1" w:unhideWhenUsed="1"/>
     <w:lsdException w:name="Table Elegant" w:semiHidden="1" w:unhideWhenUsed="1"/>
     <w:lsdException w:name="Table Professional" w:semiHidden="1" w:unhideWhenUsed="1"/>
-    <w:lsdException w:name="Table Subtle 1" w:semiHidden="1" w:unhideWhenUsed="1"/>
     <w:lsdException w:name="Table Subtle 2" w:semiHidden="1" w:unhideWhenUsed="1"/>
     <w:lsdException w:name="Table Web 1" w:semiHidden="1" w:unhideWhenUsed="1"/>
-    <w:lsdException w:name="Table Web 2" w:semiHidden="1" w:unhideWhenUsed="1"/>
-    <w:lsdException w:name="Table Web 3" w:semiHidden="1" w:unhideWhenUsed="1"/>
     <w:lsdException w:name="Balloon Text" w:semiHidden="1" w:unhideWhenUsed="1"/>
     <w:lsdException w:name="Table Grid" w:uiPriority="39"/>
     <w:lsdException w:name="Table Theme" w:semiHidden="1" w:unhideWhenUsed="1"/>
@@ -13570,6 +13320,36 @@
       <w:szCs w:val="20"/>
     </w:rPr>
   </w:style>
+  <w:style w:type="paragraph" w:styleId="Textodeglobo">
+    <w:name w:val="Balloon Text"/>
+    <w:basedOn w:val="Normal"/>
+    <w:link w:val="TextodegloboCar"/>
+    <w:uiPriority w:val="99"/>
+    <w:semiHidden/>
+    <w:unhideWhenUsed/>
+    <w:rsid w:val="00575F6B"/>
+    <w:pPr>
+      <w:spacing w:line="240" w:lineRule="auto"/>
+    </w:pPr>
+    <w:rPr>
+      <w:rFonts w:ascii="Segoe UI" w:hAnsi="Segoe UI" w:cs="Segoe UI"/>
+      <w:sz w:val="18"/>
+      <w:szCs w:val="18"/>
+    </w:rPr>
+  </w:style>
+  <w:style w:type="character" w:customStyle="1" w:styleId="TextodegloboCar">
+    <w:name w:val="Texto de globo Car"/>
+    <w:basedOn w:val="Fuentedeprrafopredeter"/>
+    <w:link w:val="Textodeglobo"/>
+    <w:uiPriority w:val="99"/>
+    <w:semiHidden/>
+    <w:rsid w:val="00575F6B"/>
+    <w:rPr>
+      <w:rFonts w:ascii="Segoe UI" w:hAnsi="Segoe UI" w:cs="Segoe UI"/>
+      <w:sz w:val="18"/>
+      <w:szCs w:val="18"/>
+    </w:rPr>
+  </w:style>
 </w:styles>
 </file>
 
@@ -13898,7 +13678,7 @@
 </file>
 
 <file path=customXml/itemProps1.xml><?xml version="1.0" encoding="utf-8"?>
-<ds:datastoreItem xmlns:ds="http://schemas.openxmlformats.org/officeDocument/2006/customXml" ds:itemID="{4D369D04-6918-4DE7-9DE4-5F86CC699600}">
+<ds:datastoreItem xmlns:ds="http://schemas.openxmlformats.org/officeDocument/2006/customXml" ds:itemID="{CC73EE7D-9FA3-4229-B105-0BF488D761A9}">
   <ds:schemaRefs>
     <ds:schemaRef ds:uri="http://schemas.openxmlformats.org/officeDocument/2006/bibliography"/>
   </ds:schemaRefs>

</xml_diff>